<commit_message>
add doc for post lab
</commit_message>
<xml_diff>
--- a/post_lab.docx
+++ b/post_lab.docx
@@ -123,7 +123,7 @@
         <w:pStyle w:val="ListParagraph"/>
         <w:spacing w:line="240" w:lineRule="auto"/>
         <w:rPr>
-          <w:rFonts w:ascii="Times New Roman" w:hAnsi="Times New Roman" w:cs="Times New Roman"/>
+          <w:rFonts w:ascii="Times New Roman" w:hAnsi="Times New Roman" w:cs="Times New Roman" w:hint="eastAsia"/>
         </w:rPr>
       </w:pPr>
     </w:p>
@@ -143,42 +143,7 @@
         <w:rPr>
           <w:rFonts w:ascii="Times New Roman" w:hAnsi="Times New Roman" w:cs="Times New Roman"/>
         </w:rPr>
-        <w:t xml:space="preserve">Inaccurate Sensor Readings: The distance sensor wasn't very precise. It was supposed to stop the robot 40 cm from the wall, but it usually stopped somewhere between 35 cm and 45 cm. We think the drifting </w:t>
-      </w:r>
-      <w:proofErr w:type="gramStart"/>
-      <w:r>
-        <w:rPr>
-          <w:rFonts w:ascii="Times New Roman" w:hAnsi="Times New Roman" w:cs="Times New Roman"/>
-        </w:rPr>
-        <w:t>made</w:t>
-      </w:r>
-      <w:proofErr w:type="gramEnd"/>
-      <w:r>
-        <w:rPr>
-          <w:rFonts w:ascii="Times New Roman" w:hAnsi="Times New Roman" w:cs="Times New Roman"/>
-        </w:rPr>
-        <w:t xml:space="preserve"> this problem worse. There was one </w:t>
-      </w:r>
-      <w:proofErr w:type="gramStart"/>
-      <w:r>
-        <w:rPr>
-          <w:rFonts w:ascii="Times New Roman" w:hAnsi="Times New Roman" w:cs="Times New Roman"/>
-        </w:rPr>
-        <w:t>really bad</w:t>
-      </w:r>
-      <w:proofErr w:type="gramEnd"/>
-      <w:r>
-        <w:rPr>
-          <w:rFonts w:ascii="Times New Roman" w:hAnsi="Times New Roman" w:cs="Times New Roman"/>
-        </w:rPr>
-        <w:t xml:space="preserve"> run </w:t>
-      </w:r>
-      <w:proofErr w:type="gramStart"/>
-      <w:r>
-        <w:rPr>
-          <w:rFonts w:ascii="Times New Roman" w:hAnsi="Times New Roman" w:cs="Times New Roman"/>
-        </w:rPr>
-        <w:t>where</w:t>
+        <w:t>Inaccurate Sensor Readings: The distance sensor wasn't very precise. It was supposed to stop the robot 40 cm from the wall, but it usually stopped somewhere between 35 cm and 45 cm. We think the drifting made this problem worse. There was one really bad run where</w:t>
       </w:r>
       <w:r>
         <w:rPr>
@@ -186,7 +151,6 @@
         </w:rPr>
         <w:t>,</w:t>
       </w:r>
-      <w:proofErr w:type="gramEnd"/>
       <w:r>
         <w:rPr>
           <w:rFonts w:ascii="Times New Roman" w:hAnsi="Times New Roman" w:cs="Times New Roman"/>
@@ -203,27 +167,12 @@
         <w:rPr>
           <w:rFonts w:ascii="Times New Roman" w:hAnsi="Times New Roman" w:cs="Times New Roman"/>
         </w:rPr>
-        <w:t xml:space="preserve"> but only moved 5 cm. We think this happened because the robot drifted so far left that its sensor wasn't pointing at the board </w:t>
-      </w:r>
-      <w:proofErr w:type="gramStart"/>
-      <w:r>
-        <w:rPr>
-          <w:rFonts w:ascii="Times New Roman" w:hAnsi="Times New Roman" w:cs="Times New Roman"/>
-        </w:rPr>
-        <w:t>anymore, but</w:t>
-      </w:r>
-      <w:proofErr w:type="gramEnd"/>
-      <w:r>
-        <w:rPr>
-          <w:rFonts w:ascii="Times New Roman" w:hAnsi="Times New Roman" w:cs="Times New Roman"/>
-        </w:rPr>
-        <w:t xml:space="preserve"> was measuring the distance to the wall far behind it.</w:t>
+        <w:t xml:space="preserve"> but only moved 5 cm. We think this happened because the robot drifted so far left that its sensor wasn't pointing at the board anymore, but was measuring the distance to the wall far behind it.</w:t>
       </w:r>
     </w:p>
     <w:p>
       <w:pPr>
         <w:spacing w:line="240" w:lineRule="auto"/>
-        <w:ind w:left="720"/>
         <w:rPr>
           <w:rFonts w:ascii="Times New Roman" w:hAnsi="Times New Roman" w:cs="Times New Roman"/>
         </w:rPr>
@@ -311,21 +260,7 @@
         <w:rPr>
           <w:rFonts w:ascii="Times New Roman" w:hAnsi="Times New Roman" w:cs="Times New Roman"/>
         </w:rPr>
-        <w:t xml:space="preserve">We believe the robot's physical build is fine; the issues we found are mostly with the code. To make it perform better next time, we </w:t>
-      </w:r>
-      <w:proofErr w:type="gramStart"/>
-      <w:r>
-        <w:rPr>
-          <w:rFonts w:ascii="Times New Roman" w:hAnsi="Times New Roman" w:cs="Times New Roman"/>
-        </w:rPr>
-        <w:t>would</w:t>
-      </w:r>
-      <w:proofErr w:type="gramEnd"/>
-      <w:r>
-        <w:rPr>
-          <w:rFonts w:ascii="Times New Roman" w:hAnsi="Times New Roman" w:cs="Times New Roman"/>
-        </w:rPr>
-        <w:t xml:space="preserve"> focus on these software improvements:</w:t>
+        <w:t>We believe the robot's physical build is fine; the issues we found are mostly with the code. To make it perform better next time, we would focus on these software improvements:</w:t>
       </w:r>
     </w:p>
     <w:p>

</xml_diff>